<commit_message>
Fix workflow diagram in characterization manual using tables
- Replaced ASCII diagram with proper Word tables
- Each phase now displayed in colored boxes (blue gradient)
- Arrows between phases for clear visual flow
- Better rendering in Microsoft Word

https://claude.ai/code/session_015AJWwnL2NDibpa2toFngHj
</commit_message>
<xml_diff>
--- a/mod/caracterizacion/docs/MANUAL_CARACTERIZACION_RED_UDES.docx
+++ b/mod/caracterizacion/docs/MANUAL_CARACTERIZACION_RED_UDES.docx
@@ -5011,40 +5011,367 @@
       </w:r>
     </w:p>
     <w:p/>
-    <w:p>
-      <w:r>
-        <w:rPr>
-          <w:rFonts w:ascii="Arial" w:cs="Arial" w:eastAsia="Arial" w:hAnsi="Arial"/>
-          <w:b/>
-          <w:bCs/>
+    <w:tbl>
+      <w:tblPr>
+        <w:tblW w:type="pct" w:w="100%"/>
+        <w:tblBorders>
+          <w:top w:val="single" w:color="auto" w:sz="4"/>
+          <w:left w:val="single" w:color="auto" w:sz="4"/>
+          <w:bottom w:val="single" w:color="auto" w:sz="4"/>
+          <w:right w:val="single" w:color="auto" w:sz="4"/>
+          <w:insideH w:val="single" w:color="auto" w:sz="4"/>
+          <w:insideV w:val="single" w:color="auto" w:sz="4"/>
+        </w:tblBorders>
+      </w:tblPr>
+      <w:tblGrid>
+        <w:gridCol w:w="100"/>
+        <w:gridCol w:w="100"/>
+        <w:gridCol w:w="100"/>
+        <w:gridCol w:w="100"/>
+        <w:gridCol w:w="100"/>
+      </w:tblGrid>
+      <w:tr>
+        <w:tc>
+          <w:tcPr>
+            <w:tcW w:type="pct" w:w="33%"/>
+            <w:shd w:fill="2874a6"/>
+          </w:tcPr>
+          <w:p>
+            <w:pPr>
+              <w:jc w:val="center"/>
+            </w:pPr>
+            <w:r>
+              <w:rPr>
+                <w:rFonts w:ascii="Arial" w:cs="Arial" w:eastAsia="Arial" w:hAnsi="Arial"/>
+                <w:b/>
+                <w:bCs/>
+                <w:color w:val="FFFFFF"/>
+                <w:sz w:val="22"/>
+                <w:szCs w:val="22"/>
+              </w:rPr>
+              <w:t xml:space="preserve">FASE 1</w:t>
+            </w:r>
+          </w:p>
+          <w:p>
+            <w:pPr>
+              <w:jc w:val="center"/>
+            </w:pPr>
+            <w:r>
+              <w:rPr>
+                <w:rFonts w:ascii="Arial" w:cs="Arial" w:eastAsia="Arial" w:hAnsi="Arial"/>
+                <w:color w:val="FFFFFF"/>
+                <w:sz w:val="18"/>
+                <w:szCs w:val="18"/>
+              </w:rPr>
+              <w:t xml:space="preserve">Diligencia la Caracterización</w:t>
+            </w:r>
+          </w:p>
+        </w:tc>
+        <w:tc>
+          <w:tcPr>
+            <w:tcW w:type="pct" w:w="1%"/>
+            <w:vAlign w:val="center"/>
+          </w:tcPr>
+          <w:p>
+            <w:pPr>
+              <w:jc w:val="center"/>
+            </w:pPr>
+            <w:r>
+              <w:rPr>
+                <w:rFonts w:ascii="Arial" w:cs="Arial" w:eastAsia="Arial" w:hAnsi="Arial"/>
+                <w:b/>
+                <w:bCs/>
+                <w:sz w:val="28"/>
+                <w:szCs w:val="28"/>
+              </w:rPr>
+              <w:t xml:space="preserve">→</w:t>
+            </w:r>
+          </w:p>
+        </w:tc>
+        <w:tc>
+          <w:tcPr>
+            <w:tcW w:type="pct" w:w="33%"/>
+            <w:shd w:fill="2e86ab"/>
+          </w:tcPr>
+          <w:p>
+            <w:pPr>
+              <w:jc w:val="center"/>
+            </w:pPr>
+            <w:r>
+              <w:rPr>
+                <w:rFonts w:ascii="Arial" w:cs="Arial" w:eastAsia="Arial" w:hAnsi="Arial"/>
+                <w:b/>
+                <w:bCs/>
+                <w:color w:val="FFFFFF"/>
+                <w:sz w:val="22"/>
+                <w:szCs w:val="22"/>
+              </w:rPr>
+              <w:t xml:space="preserve">FASE 2</w:t>
+            </w:r>
+          </w:p>
+          <w:p>
+            <w:pPr>
+              <w:jc w:val="center"/>
+            </w:pPr>
+            <w:r>
+              <w:rPr>
+                <w:rFonts w:ascii="Arial" w:cs="Arial" w:eastAsia="Arial" w:hAnsi="Arial"/>
+                <w:color w:val="FFFFFF"/>
+                <w:sz w:val="18"/>
+                <w:szCs w:val="18"/>
+              </w:rPr>
+              <w:t xml:space="preserve">Revisión Curricular</w:t>
+            </w:r>
+          </w:p>
+        </w:tc>
+        <w:tc>
+          <w:tcPr>
+            <w:tcW w:type="pct" w:w="1%"/>
+            <w:vAlign w:val="center"/>
+          </w:tcPr>
+          <w:p>
+            <w:pPr>
+              <w:jc w:val="center"/>
+            </w:pPr>
+            <w:r>
+              <w:rPr>
+                <w:rFonts w:ascii="Arial" w:cs="Arial" w:eastAsia="Arial" w:hAnsi="Arial"/>
+                <w:b/>
+                <w:bCs/>
+                <w:sz w:val="28"/>
+                <w:szCs w:val="28"/>
+              </w:rPr>
+              <w:t xml:space="preserve">→</w:t>
+            </w:r>
+          </w:p>
+        </w:tc>
+        <w:tc>
+          <w:tcPr>
+            <w:tcW w:type="pct" w:w="33%"/>
+            <w:shd w:fill="5dade2"/>
+          </w:tcPr>
+          <w:p>
+            <w:pPr>
+              <w:jc w:val="center"/>
+            </w:pPr>
+            <w:r>
+              <w:rPr>
+                <w:rFonts w:ascii="Arial" w:cs="Arial" w:eastAsia="Arial" w:hAnsi="Arial"/>
+                <w:b/>
+                <w:bCs/>
+                <w:color w:val="FFFFFF"/>
+                <w:sz w:val="22"/>
+                <w:szCs w:val="22"/>
+              </w:rPr>
+              <w:t xml:space="preserve">FASE 3</w:t>
+            </w:r>
+          </w:p>
+          <w:p>
+            <w:pPr>
+              <w:jc w:val="center"/>
+            </w:pPr>
+            <w:r>
+              <w:rPr>
+                <w:rFonts w:ascii="Arial" w:cs="Arial" w:eastAsia="Arial" w:hAnsi="Arial"/>
+                <w:color w:val="FFFFFF"/>
+                <w:sz w:val="18"/>
+                <w:szCs w:val="18"/>
+              </w:rPr>
+              <w:t xml:space="preserve">Par / Corrector de Estilo</w:t>
+            </w:r>
+          </w:p>
+        </w:tc>
+      </w:tr>
+    </w:tbl>
+    <w:p/>
+    <w:p>
+      <w:pPr>
+        <w:jc w:val="right"/>
+      </w:pPr>
+      <w:r>
+        <w:rPr>
+          <w:rFonts w:ascii="Arial" w:cs="Arial" w:eastAsia="Arial" w:hAnsi="Arial"/>
+          <w:i/>
+          <w:iCs/>
           <w:sz w:val="20"/>
           <w:szCs w:val="20"/>
         </w:rPr>
-        <w:t xml:space="preserve">[FASE 1: Caracterización] → [FASE 2: Revisión Curricular] → [FASE 3: Par/Corrector de Estilo]</w:t>
-      </w:r>
-    </w:p>
-    <w:p>
-      <w:r>
-        <w:rPr>
-          <w:rFonts w:ascii="Arial" w:cs="Arial" w:eastAsia="Arial" w:hAnsi="Arial"/>
-          <w:sz w:val="20"/>
-          <w:szCs w:val="20"/>
-        </w:rPr>
-        <w:t xml:space="preserve">                                                                              ↓</w:t>
-      </w:r>
-    </w:p>
-    <w:p>
-      <w:r>
-        <w:rPr>
-          <w:rFonts w:ascii="Arial" w:cs="Arial" w:eastAsia="Arial" w:hAnsi="Arial"/>
-          <w:b/>
-          <w:bCs/>
-          <w:sz w:val="20"/>
-          <w:szCs w:val="20"/>
-        </w:rPr>
-        <w:t xml:space="preserve">[FASE 6: Aprobación Final] ← [FASE 5: Alistamiento Moodle] ← [FASE 4: Producción]</w:t>
-      </w:r>
-    </w:p>
+        <w:t xml:space="preserve">↓ Continúa el flujo...</w:t>
+      </w:r>
+    </w:p>
+    <w:p/>
+    <w:tbl>
+      <w:tblPr>
+        <w:tblW w:type="pct" w:w="100%"/>
+        <w:tblBorders>
+          <w:top w:val="single" w:color="auto" w:sz="4"/>
+          <w:left w:val="single" w:color="auto" w:sz="4"/>
+          <w:bottom w:val="single" w:color="auto" w:sz="4"/>
+          <w:right w:val="single" w:color="auto" w:sz="4"/>
+          <w:insideH w:val="single" w:color="auto" w:sz="4"/>
+          <w:insideV w:val="single" w:color="auto" w:sz="4"/>
+        </w:tblBorders>
+      </w:tblPr>
+      <w:tblGrid>
+        <w:gridCol w:w="100"/>
+        <w:gridCol w:w="100"/>
+        <w:gridCol w:w="100"/>
+        <w:gridCol w:w="100"/>
+        <w:gridCol w:w="100"/>
+      </w:tblGrid>
+      <w:tr>
+        <w:tc>
+          <w:tcPr>
+            <w:tcW w:type="pct" w:w="33%"/>
+            <w:shd w:fill="1abc9c"/>
+          </w:tcPr>
+          <w:p>
+            <w:pPr>
+              <w:jc w:val="center"/>
+            </w:pPr>
+            <w:r>
+              <w:rPr>
+                <w:rFonts w:ascii="Arial" w:cs="Arial" w:eastAsia="Arial" w:hAnsi="Arial"/>
+                <w:b/>
+                <w:bCs/>
+                <w:color w:val="FFFFFF"/>
+                <w:sz w:val="22"/>
+                <w:szCs w:val="22"/>
+              </w:rPr>
+              <w:t xml:space="preserve">FASE 4</w:t>
+            </w:r>
+          </w:p>
+          <w:p>
+            <w:pPr>
+              <w:jc w:val="center"/>
+            </w:pPr>
+            <w:r>
+              <w:rPr>
+                <w:rFonts w:ascii="Arial" w:cs="Arial" w:eastAsia="Arial" w:hAnsi="Arial"/>
+                <w:color w:val="FFFFFF"/>
+                <w:sz w:val="18"/>
+                <w:szCs w:val="18"/>
+              </w:rPr>
+              <w:t xml:space="preserve">Producción</w:t>
+            </w:r>
+          </w:p>
+        </w:tc>
+        <w:tc>
+          <w:tcPr>
+            <w:tcW w:type="pct" w:w="1%"/>
+            <w:vAlign w:val="center"/>
+          </w:tcPr>
+          <w:p>
+            <w:pPr>
+              <w:jc w:val="center"/>
+            </w:pPr>
+            <w:r>
+              <w:rPr>
+                <w:rFonts w:ascii="Arial" w:cs="Arial" w:eastAsia="Arial" w:hAnsi="Arial"/>
+                <w:b/>
+                <w:bCs/>
+                <w:sz w:val="28"/>
+                <w:szCs w:val="28"/>
+              </w:rPr>
+              <w:t xml:space="preserve">→</w:t>
+            </w:r>
+          </w:p>
+        </w:tc>
+        <w:tc>
+          <w:tcPr>
+            <w:tcW w:type="pct" w:w="33%"/>
+            <w:shd w:fill="27ae60"/>
+          </w:tcPr>
+          <w:p>
+            <w:pPr>
+              <w:jc w:val="center"/>
+            </w:pPr>
+            <w:r>
+              <w:rPr>
+                <w:rFonts w:ascii="Arial" w:cs="Arial" w:eastAsia="Arial" w:hAnsi="Arial"/>
+                <w:b/>
+                <w:bCs/>
+                <w:color w:val="FFFFFF"/>
+                <w:sz w:val="22"/>
+                <w:szCs w:val="22"/>
+              </w:rPr>
+              <w:t xml:space="preserve">FASE 5</w:t>
+            </w:r>
+          </w:p>
+          <w:p>
+            <w:pPr>
+              <w:jc w:val="center"/>
+            </w:pPr>
+            <w:r>
+              <w:rPr>
+                <w:rFonts w:ascii="Arial" w:cs="Arial" w:eastAsia="Arial" w:hAnsi="Arial"/>
+                <w:color w:val="FFFFFF"/>
+                <w:sz w:val="18"/>
+                <w:szCs w:val="18"/>
+              </w:rPr>
+              <w:t xml:space="preserve">Alistamiento en Moodle</w:t>
+            </w:r>
+          </w:p>
+        </w:tc>
+        <w:tc>
+          <w:tcPr>
+            <w:tcW w:type="pct" w:w="1%"/>
+            <w:vAlign w:val="center"/>
+          </w:tcPr>
+          <w:p>
+            <w:pPr>
+              <w:jc w:val="center"/>
+            </w:pPr>
+            <w:r>
+              <w:rPr>
+                <w:rFonts w:ascii="Arial" w:cs="Arial" w:eastAsia="Arial" w:hAnsi="Arial"/>
+                <w:b/>
+                <w:bCs/>
+                <w:sz w:val="28"/>
+                <w:szCs w:val="28"/>
+              </w:rPr>
+              <w:t xml:space="preserve">→</w:t>
+            </w:r>
+          </w:p>
+        </w:tc>
+        <w:tc>
+          <w:tcPr>
+            <w:tcW w:type="pct" w:w="33%"/>
+            <w:shd w:fill="16a085"/>
+          </w:tcPr>
+          <w:p>
+            <w:pPr>
+              <w:jc w:val="center"/>
+            </w:pPr>
+            <w:r>
+              <w:rPr>
+                <w:rFonts w:ascii="Arial" w:cs="Arial" w:eastAsia="Arial" w:hAnsi="Arial"/>
+                <w:b/>
+                <w:bCs/>
+                <w:color w:val="FFFFFF"/>
+                <w:sz w:val="22"/>
+                <w:szCs w:val="22"/>
+              </w:rPr>
+              <w:t xml:space="preserve">FASE 6</w:t>
+            </w:r>
+          </w:p>
+          <w:p>
+            <w:pPr>
+              <w:jc w:val="center"/>
+            </w:pPr>
+            <w:r>
+              <w:rPr>
+                <w:rFonts w:ascii="Arial" w:cs="Arial" w:eastAsia="Arial" w:hAnsi="Arial"/>
+                <w:color w:val="FFFFFF"/>
+                <w:sz w:val="18"/>
+                <w:szCs w:val="18"/>
+              </w:rPr>
+              <w:t xml:space="preserve">Aprobación Final</w:t>
+            </w:r>
+          </w:p>
+        </w:tc>
+      </w:tr>
+    </w:tbl>
     <w:p/>
     <w:p>
       <w:pPr>

</xml_diff>

<commit_message>
Update notifications and manual for Jefe de Medios role
- Add jefe_medios to phase 3 notification targets in lib.php
- Update generate_manual.js to include all 9 UDES roles
- Regenerate MANUAL_CARACTERIZACION_RED_UDES.docx with complete documentation

https://claude.ai/code/session_015AJWwnL2NDibpa2toFngHj
</commit_message>
<xml_diff>
--- a/mod/caracterizacion/docs/MANUAL_CARACTERIZACION_RED_UDES.docx
+++ b/mod/caracterizacion/docs/MANUAL_CARACTERIZACION_RED_UDES.docx
@@ -1833,6 +1833,59 @@
                 <w:sz w:val="20"/>
                 <w:szCs w:val="20"/>
               </w:rPr>
+              <w:t xml:space="preserve">Jefe de Medios</w:t>
+            </w:r>
+          </w:p>
+        </w:tc>
+        <w:tc>
+          <w:p>
+            <w:pPr>
+              <w:jc w:val="left"/>
+            </w:pPr>
+            <w:r>
+              <w:rPr>
+                <w:rFonts w:ascii="Arial" w:cs="Arial" w:eastAsia="Arial" w:hAnsi="Arial"/>
+                <w:b w:val="false"/>
+                <w:bCs w:val="false"/>
+                <w:sz w:val="20"/>
+                <w:szCs w:val="20"/>
+              </w:rPr>
+              <w:t xml:space="preserve">udes_jefe_medios</w:t>
+            </w:r>
+          </w:p>
+        </w:tc>
+        <w:tc>
+          <w:p>
+            <w:pPr>
+              <w:jc w:val="left"/>
+            </w:pPr>
+            <w:r>
+              <w:rPr>
+                <w:rFonts w:ascii="Arial" w:cs="Arial" w:eastAsia="Arial" w:hAnsi="Arial"/>
+                <w:b w:val="false"/>
+                <w:bCs w:val="false"/>
+                <w:sz w:val="20"/>
+                <w:szCs w:val="20"/>
+              </w:rPr>
+              <w:t xml:space="preserve">editingteacher</w:t>
+            </w:r>
+          </w:p>
+        </w:tc>
+      </w:tr>
+      <w:tr>
+        <w:tc>
+          <w:p>
+            <w:pPr>
+              <w:jc w:val="left"/>
+            </w:pPr>
+            <w:r>
+              <w:rPr>
+                <w:rFonts w:ascii="Arial" w:cs="Arial" w:eastAsia="Arial" w:hAnsi="Arial"/>
+                <w:b w:val="false"/>
+                <w:bCs w:val="false"/>
+                <w:sz w:val="20"/>
+                <w:szCs w:val="20"/>
+              </w:rPr>
               <w:t xml:space="preserve">Producción</w:t>
             </w:r>
           </w:p>
@@ -1982,7 +2035,7 @@
           <w:sz w:val="22"/>
           <w:szCs w:val="22"/>
         </w:rPr>
-        <w:t xml:space="preserve">3. Verifique que la versión mostrada sea la correcta (1.1.2)</w:t>
+        <w:t xml:space="preserve">3. Verifique que la versión mostrada sea la correcta (1.2.0)</w:t>
       </w:r>
     </w:p>
     <w:p>
@@ -2002,7 +2055,7 @@
           <w:sz w:val="22"/>
           <w:szCs w:val="22"/>
         </w:rPr>
-        <w:t xml:space="preserve">5. Verifique que los 8 roles UDES estén presentes en la lista</w:t>
+        <w:t xml:space="preserve">5. Verifique que los 9 roles UDES estén presentes en la lista</w:t>
       </w:r>
     </w:p>
     <w:p>
@@ -2034,7 +2087,7 @@
           <w:sz w:val="22"/>
           <w:szCs w:val="22"/>
         </w:rPr>
-        <w:t xml:space="preserve">El plugin define 8 roles específicos que corresponden a los actores del proceso de producción de RED de la UDES. Cada rol tiene permisos específicos que determinan qué acciones puede realizar en cada fase del proceso.</w:t>
+        <w:t xml:space="preserve">El plugin define 9 roles específicos que corresponden a los actores del proceso de producción de RED de la UDES. Cada rol tiene permisos específicos que determinan qué acciones puede realizar en cada fase del proceso.</w:t>
       </w:r>
     </w:p>
     <w:p/>
@@ -2679,18 +2732,18 @@
           <w:sz w:val="24"/>
           <w:szCs w:val="24"/>
         </w:rPr>
-        <w:t xml:space="preserve">4.1.7 Producción (Diseñador)</w:t>
-      </w:r>
-    </w:p>
-    <w:p/>
-    <w:p>
-      <w:r>
-        <w:rPr>
-          <w:rFonts w:ascii="Arial" w:cs="Arial" w:eastAsia="Arial" w:hAnsi="Arial"/>
-          <w:sz w:val="22"/>
-          <w:szCs w:val="22"/>
-        </w:rPr>
-        <w:t xml:space="preserve">Descripción: El profesional de Producción es responsable de crear los recursos educativos digitales según las especificaciones de la caracterización.</w:t>
+        <w:t xml:space="preserve">4.1.7 Jefe de Medios</w:t>
+      </w:r>
+    </w:p>
+    <w:p/>
+    <w:p>
+      <w:r>
+        <w:rPr>
+          <w:rFonts w:ascii="Arial" w:cs="Arial" w:eastAsia="Arial" w:hAnsi="Arial"/>
+          <w:sz w:val="22"/>
+          <w:szCs w:val="22"/>
+        </w:rPr>
+        <w:t xml:space="preserve">Descripción: El Jefe de Medios Educativos es responsable de supervisar el área de producción de recursos educativos digitales. Recibe notificaciones junto con Coordinación de Producción cuando la fase 3 es aprobada.</w:t>
       </w:r>
     </w:p>
     <w:p/>
@@ -2713,58 +2766,58 @@
           <w:sz w:val="22"/>
           <w:szCs w:val="22"/>
         </w:rPr>
-        <w:t xml:space="preserve">• Crear videos, infografías, interactivos y demás RED</w:t>
-      </w:r>
-    </w:p>
-    <w:p>
-      <w:r>
-        <w:rPr>
-          <w:rFonts w:ascii="Arial" w:cs="Arial" w:eastAsia="Arial" w:hAnsi="Arial"/>
-          <w:sz w:val="22"/>
-          <w:szCs w:val="22"/>
-        </w:rPr>
-        <w:t xml:space="preserve">• Seguir las especificaciones de la caracterización</w:t>
-      </w:r>
-    </w:p>
-    <w:p>
-      <w:r>
-        <w:rPr>
-          <w:rFonts w:ascii="Arial" w:cs="Arial" w:eastAsia="Arial" w:hAnsi="Arial"/>
-          <w:sz w:val="22"/>
-          <w:szCs w:val="22"/>
-        </w:rPr>
-        <w:t xml:space="preserve">• Entregar recursos con estándares de calidad</w:t>
-      </w:r>
-    </w:p>
-    <w:p>
-      <w:r>
-        <w:rPr>
-          <w:rFonts w:ascii="Arial" w:cs="Arial" w:eastAsia="Arial" w:hAnsi="Arial"/>
-          <w:sz w:val="22"/>
-          <w:szCs w:val="22"/>
-        </w:rPr>
-        <w:t xml:space="preserve">• Documentar el estado de producción</w:t>
-      </w:r>
-    </w:p>
-    <w:p/>
-    <w:p>
-      <w:r>
-        <w:rPr>
-          <w:rFonts w:ascii="Arial" w:cs="Arial" w:eastAsia="Arial" w:hAnsi="Arial"/>
-          <w:sz w:val="22"/>
-          <w:szCs w:val="22"/>
-        </w:rPr>
-        <w:t xml:space="preserve">Fases de participación: Fase 4 (Producción)</w:t>
-      </w:r>
-    </w:p>
-    <w:p>
-      <w:r>
-        <w:rPr>
-          <w:rFonts w:ascii="Arial" w:cs="Arial" w:eastAsia="Arial" w:hAnsi="Arial"/>
-          <w:sz w:val="22"/>
-          <w:szCs w:val="22"/>
-        </w:rPr>
-        <w:t xml:space="preserve">Permisos: Ver matriz, Actuar en fase 4, Comentar</w:t>
+        <w:t xml:space="preserve">• Supervisar el proceso de producción de RED</w:t>
+      </w:r>
+    </w:p>
+    <w:p>
+      <w:r>
+        <w:rPr>
+          <w:rFonts w:ascii="Arial" w:cs="Arial" w:eastAsia="Arial" w:hAnsi="Arial"/>
+          <w:sz w:val="22"/>
+          <w:szCs w:val="22"/>
+        </w:rPr>
+        <w:t xml:space="preserve">• Recibir notificaciones cuando se aprueban las caracterizaciones</w:t>
+      </w:r>
+    </w:p>
+    <w:p>
+      <w:r>
+        <w:rPr>
+          <w:rFonts w:ascii="Arial" w:cs="Arial" w:eastAsia="Arial" w:hAnsi="Arial"/>
+          <w:sz w:val="22"/>
+          <w:szCs w:val="22"/>
+        </w:rPr>
+        <w:t xml:space="preserve">• Monitorear el estado de las producciones</w:t>
+      </w:r>
+    </w:p>
+    <w:p>
+      <w:r>
+        <w:rPr>
+          <w:rFonts w:ascii="Arial" w:cs="Arial" w:eastAsia="Arial" w:hAnsi="Arial"/>
+          <w:sz w:val="22"/>
+          <w:szCs w:val="22"/>
+        </w:rPr>
+        <w:t xml:space="preserve">• Coordinar con el equipo de producción</w:t>
+      </w:r>
+    </w:p>
+    <w:p/>
+    <w:p>
+      <w:r>
+        <w:rPr>
+          <w:rFonts w:ascii="Arial" w:cs="Arial" w:eastAsia="Arial" w:hAnsi="Arial"/>
+          <w:sz w:val="22"/>
+          <w:szCs w:val="22"/>
+        </w:rPr>
+        <w:t xml:space="preserve">Fases de participación: Fase 4 (Producción) - Rol de supervisión</w:t>
+      </w:r>
+    </w:p>
+    <w:p>
+      <w:r>
+        <w:rPr>
+          <w:rFonts w:ascii="Arial" w:cs="Arial" w:eastAsia="Arial" w:hAnsi="Arial"/>
+          <w:sz w:val="22"/>
+          <w:szCs w:val="22"/>
+        </w:rPr>
+        <w:t xml:space="preserve">Permisos: Ver todas las matrices</w:t>
       </w:r>
     </w:p>
     <w:p/>
@@ -2778,7 +2831,106 @@
           <w:sz w:val="24"/>
           <w:szCs w:val="24"/>
         </w:rPr>
-        <w:t xml:space="preserve">4.1.8 Alistamiento</w:t>
+        <w:t xml:space="preserve">4.1.8 Producción (Diseñador)</w:t>
+      </w:r>
+    </w:p>
+    <w:p/>
+    <w:p>
+      <w:r>
+        <w:rPr>
+          <w:rFonts w:ascii="Arial" w:cs="Arial" w:eastAsia="Arial" w:hAnsi="Arial"/>
+          <w:sz w:val="22"/>
+          <w:szCs w:val="22"/>
+        </w:rPr>
+        <w:t xml:space="preserve">Descripción: El profesional de Producción es responsable de crear los recursos educativos digitales según las especificaciones de la caracterización.</w:t>
+      </w:r>
+    </w:p>
+    <w:p/>
+    <w:p>
+      <w:r>
+        <w:rPr>
+          <w:rFonts w:ascii="Arial" w:cs="Arial" w:eastAsia="Arial" w:hAnsi="Arial"/>
+          <w:b/>
+          <w:bCs/>
+          <w:sz w:val="22"/>
+          <w:szCs w:val="22"/>
+        </w:rPr>
+        <w:t xml:space="preserve">Responsabilidades principales:</w:t>
+      </w:r>
+    </w:p>
+    <w:p>
+      <w:r>
+        <w:rPr>
+          <w:rFonts w:ascii="Arial" w:cs="Arial" w:eastAsia="Arial" w:hAnsi="Arial"/>
+          <w:sz w:val="22"/>
+          <w:szCs w:val="22"/>
+        </w:rPr>
+        <w:t xml:space="preserve">• Crear videos, infografías, interactivos y demás RED</w:t>
+      </w:r>
+    </w:p>
+    <w:p>
+      <w:r>
+        <w:rPr>
+          <w:rFonts w:ascii="Arial" w:cs="Arial" w:eastAsia="Arial" w:hAnsi="Arial"/>
+          <w:sz w:val="22"/>
+          <w:szCs w:val="22"/>
+        </w:rPr>
+        <w:t xml:space="preserve">• Seguir las especificaciones de la caracterización</w:t>
+      </w:r>
+    </w:p>
+    <w:p>
+      <w:r>
+        <w:rPr>
+          <w:rFonts w:ascii="Arial" w:cs="Arial" w:eastAsia="Arial" w:hAnsi="Arial"/>
+          <w:sz w:val="22"/>
+          <w:szCs w:val="22"/>
+        </w:rPr>
+        <w:t xml:space="preserve">• Entregar recursos con estándares de calidad</w:t>
+      </w:r>
+    </w:p>
+    <w:p>
+      <w:r>
+        <w:rPr>
+          <w:rFonts w:ascii="Arial" w:cs="Arial" w:eastAsia="Arial" w:hAnsi="Arial"/>
+          <w:sz w:val="22"/>
+          <w:szCs w:val="22"/>
+        </w:rPr>
+        <w:t xml:space="preserve">• Documentar el estado de producción</w:t>
+      </w:r>
+    </w:p>
+    <w:p/>
+    <w:p>
+      <w:r>
+        <w:rPr>
+          <w:rFonts w:ascii="Arial" w:cs="Arial" w:eastAsia="Arial" w:hAnsi="Arial"/>
+          <w:sz w:val="22"/>
+          <w:szCs w:val="22"/>
+        </w:rPr>
+        <w:t xml:space="preserve">Fases de participación: Fase 4 (Producción)</w:t>
+      </w:r>
+    </w:p>
+    <w:p>
+      <w:r>
+        <w:rPr>
+          <w:rFonts w:ascii="Arial" w:cs="Arial" w:eastAsia="Arial" w:hAnsi="Arial"/>
+          <w:sz w:val="22"/>
+          <w:szCs w:val="22"/>
+        </w:rPr>
+        <w:t xml:space="preserve">Permisos: Ver matriz, Actuar en fase 4, Comentar</w:t>
+      </w:r>
+    </w:p>
+    <w:p/>
+    <w:p>
+      <w:r>
+        <w:rPr>
+          <w:rFonts w:ascii="Arial" w:cs="Arial" w:eastAsia="Arial" w:hAnsi="Arial"/>
+          <w:b/>
+          <w:bCs/>
+          <w:color w:val="5dade2"/>
+          <w:sz w:val="24"/>
+          <w:szCs w:val="24"/>
+        </w:rPr>
+        <w:t xml:space="preserve">4.1.9 Alistamiento</w:t>
       </w:r>
     </w:p>
     <w:p/>
@@ -2906,6 +3058,7 @@
         <w:gridCol w:w="100"/>
         <w:gridCol w:w="100"/>
         <w:gridCol w:w="100"/>
+        <w:gridCol w:w="100"/>
       </w:tblGrid>
       <w:tr>
         <w:tc>
@@ -3064,7 +3217,7 @@
                 <w:sz w:val="20"/>
                 <w:szCs w:val="20"/>
               </w:rPr>
-              <w:t xml:space="preserve">Prod.</w:t>
+              <w:t xml:space="preserve">Jefe</w:t>
             </w:r>
           </w:p>
         </w:tc>
@@ -3084,6 +3237,26 @@
                 <w:sz w:val="20"/>
                 <w:szCs w:val="20"/>
               </w:rPr>
+              <w:t xml:space="preserve">Prod.</w:t>
+            </w:r>
+          </w:p>
+        </w:tc>
+        <w:tc>
+          <w:tcPr>
+            <w:shd w:fill="e8f6f3"/>
+          </w:tcPr>
+          <w:p>
+            <w:pPr>
+              <w:jc w:val="left"/>
+            </w:pPr>
+            <w:r>
+              <w:rPr>
+                <w:rFonts w:ascii="Arial" w:cs="Arial" w:eastAsia="Arial" w:hAnsi="Arial"/>
+                <w:b/>
+                <w:bCs/>
+                <w:sz w:val="20"/>
+                <w:szCs w:val="20"/>
+              </w:rPr>
               <w:t xml:space="preserve">Alist.</w:t>
             </w:r>
           </w:p>
@@ -3243,6 +3416,23 @@
             </w:r>
           </w:p>
         </w:tc>
+        <w:tc>
+          <w:p>
+            <w:pPr>
+              <w:jc w:val="left"/>
+            </w:pPr>
+            <w:r>
+              <w:rPr>
+                <w:rFonts w:ascii="Arial" w:cs="Arial" w:eastAsia="Arial" w:hAnsi="Arial"/>
+                <w:b w:val="false"/>
+                <w:bCs w:val="false"/>
+                <w:sz w:val="20"/>
+                <w:szCs w:val="20"/>
+              </w:rPr>
+              <w:t xml:space="preserve">No</w:t>
+            </w:r>
+          </w:p>
+        </w:tc>
       </w:tr>
       <w:tr>
         <w:tc>
@@ -3398,6 +3588,23 @@
             </w:r>
           </w:p>
         </w:tc>
+        <w:tc>
+          <w:p>
+            <w:pPr>
+              <w:jc w:val="left"/>
+            </w:pPr>
+            <w:r>
+              <w:rPr>
+                <w:rFonts w:ascii="Arial" w:cs="Arial" w:eastAsia="Arial" w:hAnsi="Arial"/>
+                <w:b w:val="false"/>
+                <w:bCs w:val="false"/>
+                <w:sz w:val="20"/>
+                <w:szCs w:val="20"/>
+              </w:rPr>
+              <w:t xml:space="preserve">No</w:t>
+            </w:r>
+          </w:p>
+        </w:tc>
       </w:tr>
       <w:tr>
         <w:tc>
@@ -3532,6 +3739,23 @@
                 <w:sz w:val="20"/>
                 <w:szCs w:val="20"/>
               </w:rPr>
+              <w:t xml:space="preserve">Sí</w:t>
+            </w:r>
+          </w:p>
+        </w:tc>
+        <w:tc>
+          <w:p>
+            <w:pPr>
+              <w:jc w:val="left"/>
+            </w:pPr>
+            <w:r>
+              <w:rPr>
+                <w:rFonts w:ascii="Arial" w:cs="Arial" w:eastAsia="Arial" w:hAnsi="Arial"/>
+                <w:b w:val="false"/>
+                <w:bCs w:val="false"/>
+                <w:sz w:val="20"/>
+                <w:szCs w:val="20"/>
+              </w:rPr>
               <w:t xml:space="preserve">No</w:t>
             </w:r>
           </w:p>
@@ -3708,6 +3932,23 @@
             </w:r>
           </w:p>
         </w:tc>
+        <w:tc>
+          <w:p>
+            <w:pPr>
+              <w:jc w:val="left"/>
+            </w:pPr>
+            <w:r>
+              <w:rPr>
+                <w:rFonts w:ascii="Arial" w:cs="Arial" w:eastAsia="Arial" w:hAnsi="Arial"/>
+                <w:b w:val="false"/>
+                <w:bCs w:val="false"/>
+                <w:sz w:val="20"/>
+                <w:szCs w:val="20"/>
+              </w:rPr>
+              <w:t xml:space="preserve">No</w:t>
+            </w:r>
+          </w:p>
+        </w:tc>
       </w:tr>
       <w:tr>
         <w:tc>
@@ -3863,6 +4104,23 @@
             </w:r>
           </w:p>
         </w:tc>
+        <w:tc>
+          <w:p>
+            <w:pPr>
+              <w:jc w:val="left"/>
+            </w:pPr>
+            <w:r>
+              <w:rPr>
+                <w:rFonts w:ascii="Arial" w:cs="Arial" w:eastAsia="Arial" w:hAnsi="Arial"/>
+                <w:b w:val="false"/>
+                <w:bCs w:val="false"/>
+                <w:sz w:val="20"/>
+                <w:szCs w:val="20"/>
+              </w:rPr>
+              <w:t xml:space="preserve">No</w:t>
+            </w:r>
+          </w:p>
+        </w:tc>
       </w:tr>
       <w:tr>
         <w:tc>
@@ -4018,6 +4276,23 @@
             </w:r>
           </w:p>
         </w:tc>
+        <w:tc>
+          <w:p>
+            <w:pPr>
+              <w:jc w:val="left"/>
+            </w:pPr>
+            <w:r>
+              <w:rPr>
+                <w:rFonts w:ascii="Arial" w:cs="Arial" w:eastAsia="Arial" w:hAnsi="Arial"/>
+                <w:b w:val="false"/>
+                <w:bCs w:val="false"/>
+                <w:sz w:val="20"/>
+                <w:szCs w:val="20"/>
+              </w:rPr>
+              <w:t xml:space="preserve">No</w:t>
+            </w:r>
+          </w:p>
+        </w:tc>
       </w:tr>
       <w:tr>
         <w:tc>
@@ -4152,6 +4427,23 @@
                 <w:sz w:val="20"/>
                 <w:szCs w:val="20"/>
               </w:rPr>
+              <w:t xml:space="preserve">No</w:t>
+            </w:r>
+          </w:p>
+        </w:tc>
+        <w:tc>
+          <w:p>
+            <w:pPr>
+              <w:jc w:val="left"/>
+            </w:pPr>
+            <w:r>
+              <w:rPr>
+                <w:rFonts w:ascii="Arial" w:cs="Arial" w:eastAsia="Arial" w:hAnsi="Arial"/>
+                <w:b w:val="false"/>
+                <w:bCs w:val="false"/>
+                <w:sz w:val="20"/>
+                <w:szCs w:val="20"/>
+              </w:rPr>
               <w:t xml:space="preserve">Sí</w:t>
             </w:r>
           </w:p>
@@ -4324,6 +4616,23 @@
                 <w:sz w:val="20"/>
                 <w:szCs w:val="20"/>
               </w:rPr>
+              <w:t xml:space="preserve">No</w:t>
+            </w:r>
+          </w:p>
+        </w:tc>
+        <w:tc>
+          <w:p>
+            <w:pPr>
+              <w:jc w:val="left"/>
+            </w:pPr>
+            <w:r>
+              <w:rPr>
+                <w:rFonts w:ascii="Arial" w:cs="Arial" w:eastAsia="Arial" w:hAnsi="Arial"/>
+                <w:b w:val="false"/>
+                <w:bCs w:val="false"/>
+                <w:sz w:val="20"/>
+                <w:szCs w:val="20"/>
+              </w:rPr>
               <w:t xml:space="preserve">Sí</w:t>
             </w:r>
           </w:p>
@@ -4483,6 +4792,23 @@
             </w:r>
           </w:p>
         </w:tc>
+        <w:tc>
+          <w:p>
+            <w:pPr>
+              <w:jc w:val="left"/>
+            </w:pPr>
+            <w:r>
+              <w:rPr>
+                <w:rFonts w:ascii="Arial" w:cs="Arial" w:eastAsia="Arial" w:hAnsi="Arial"/>
+                <w:b w:val="false"/>
+                <w:bCs w:val="false"/>
+                <w:sz w:val="20"/>
+                <w:szCs w:val="20"/>
+              </w:rPr>
+              <w:t xml:space="preserve">No</w:t>
+            </w:r>
+          </w:p>
+        </w:tc>
       </w:tr>
       <w:tr>
         <w:tc>
@@ -4638,6 +4964,23 @@
             </w:r>
           </w:p>
         </w:tc>
+        <w:tc>
+          <w:p>
+            <w:pPr>
+              <w:jc w:val="left"/>
+            </w:pPr>
+            <w:r>
+              <w:rPr>
+                <w:rFonts w:ascii="Arial" w:cs="Arial" w:eastAsia="Arial" w:hAnsi="Arial"/>
+                <w:b w:val="false"/>
+                <w:bCs w:val="false"/>
+                <w:sz w:val="20"/>
+                <w:szCs w:val="20"/>
+              </w:rPr>
+              <w:t xml:space="preserve">No</w:t>
+            </w:r>
+          </w:p>
+        </w:tc>
       </w:tr>
       <w:tr>
         <w:tc>
@@ -4793,6 +5136,23 @@
             </w:r>
           </w:p>
         </w:tc>
+        <w:tc>
+          <w:p>
+            <w:pPr>
+              <w:jc w:val="left"/>
+            </w:pPr>
+            <w:r>
+              <w:rPr>
+                <w:rFonts w:ascii="Arial" w:cs="Arial" w:eastAsia="Arial" w:hAnsi="Arial"/>
+                <w:b w:val="false"/>
+                <w:bCs w:val="false"/>
+                <w:sz w:val="20"/>
+                <w:szCs w:val="20"/>
+              </w:rPr>
+              <w:t xml:space="preserve">No</w:t>
+            </w:r>
+          </w:p>
+        </w:tc>
       </w:tr>
       <w:tr>
         <w:tc>
@@ -4944,7 +5304,196 @@
                 <w:sz w:val="20"/>
                 <w:szCs w:val="20"/>
               </w:rPr>
+              <w:t xml:space="preserve">No</w:t>
+            </w:r>
+          </w:p>
+        </w:tc>
+        <w:tc>
+          <w:p>
+            <w:pPr>
+              <w:jc w:val="left"/>
+            </w:pPr>
+            <w:r>
+              <w:rPr>
+                <w:rFonts w:ascii="Arial" w:cs="Arial" w:eastAsia="Arial" w:hAnsi="Arial"/>
+                <w:b w:val="false"/>
+                <w:bCs w:val="false"/>
+                <w:sz w:val="20"/>
+                <w:szCs w:val="20"/>
+              </w:rPr>
               <w:t xml:space="preserve">Sí</w:t>
+            </w:r>
+          </w:p>
+        </w:tc>
+      </w:tr>
+      <w:tr>
+        <w:tc>
+          <w:p>
+            <w:pPr>
+              <w:jc w:val="left"/>
+            </w:pPr>
+            <w:r>
+              <w:rPr>
+                <w:rFonts w:ascii="Arial" w:cs="Arial" w:eastAsia="Arial" w:hAnsi="Arial"/>
+                <w:b w:val="false"/>
+                <w:bCs w:val="false"/>
+                <w:sz w:val="20"/>
+                <w:szCs w:val="20"/>
+              </w:rPr>
+              <w:t xml:space="preserve">Notificado Fase 3→4</w:t>
+            </w:r>
+          </w:p>
+        </w:tc>
+        <w:tc>
+          <w:p>
+            <w:pPr>
+              <w:jc w:val="left"/>
+            </w:pPr>
+            <w:r>
+              <w:rPr>
+                <w:rFonts w:ascii="Arial" w:cs="Arial" w:eastAsia="Arial" w:hAnsi="Arial"/>
+                <w:b w:val="false"/>
+                <w:bCs w:val="false"/>
+                <w:sz w:val="20"/>
+                <w:szCs w:val="20"/>
+              </w:rPr>
+              <w:t xml:space="preserve">No</w:t>
+            </w:r>
+          </w:p>
+        </w:tc>
+        <w:tc>
+          <w:p>
+            <w:pPr>
+              <w:jc w:val="left"/>
+            </w:pPr>
+            <w:r>
+              <w:rPr>
+                <w:rFonts w:ascii="Arial" w:cs="Arial" w:eastAsia="Arial" w:hAnsi="Arial"/>
+                <w:b w:val="false"/>
+                <w:bCs w:val="false"/>
+                <w:sz w:val="20"/>
+                <w:szCs w:val="20"/>
+              </w:rPr>
+              <w:t xml:space="preserve">No</w:t>
+            </w:r>
+          </w:p>
+        </w:tc>
+        <w:tc>
+          <w:p>
+            <w:pPr>
+              <w:jc w:val="left"/>
+            </w:pPr>
+            <w:r>
+              <w:rPr>
+                <w:rFonts w:ascii="Arial" w:cs="Arial" w:eastAsia="Arial" w:hAnsi="Arial"/>
+                <w:b w:val="false"/>
+                <w:bCs w:val="false"/>
+                <w:sz w:val="20"/>
+                <w:szCs w:val="20"/>
+              </w:rPr>
+              <w:t xml:space="preserve">No</w:t>
+            </w:r>
+          </w:p>
+        </w:tc>
+        <w:tc>
+          <w:p>
+            <w:pPr>
+              <w:jc w:val="left"/>
+            </w:pPr>
+            <w:r>
+              <w:rPr>
+                <w:rFonts w:ascii="Arial" w:cs="Arial" w:eastAsia="Arial" w:hAnsi="Arial"/>
+                <w:b w:val="false"/>
+                <w:bCs w:val="false"/>
+                <w:sz w:val="20"/>
+                <w:szCs w:val="20"/>
+              </w:rPr>
+              <w:t xml:space="preserve">No</w:t>
+            </w:r>
+          </w:p>
+        </w:tc>
+        <w:tc>
+          <w:p>
+            <w:pPr>
+              <w:jc w:val="left"/>
+            </w:pPr>
+            <w:r>
+              <w:rPr>
+                <w:rFonts w:ascii="Arial" w:cs="Arial" w:eastAsia="Arial" w:hAnsi="Arial"/>
+                <w:b w:val="false"/>
+                <w:bCs w:val="false"/>
+                <w:sz w:val="20"/>
+                <w:szCs w:val="20"/>
+              </w:rPr>
+              <w:t xml:space="preserve">No</w:t>
+            </w:r>
+          </w:p>
+        </w:tc>
+        <w:tc>
+          <w:p>
+            <w:pPr>
+              <w:jc w:val="left"/>
+            </w:pPr>
+            <w:r>
+              <w:rPr>
+                <w:rFonts w:ascii="Arial" w:cs="Arial" w:eastAsia="Arial" w:hAnsi="Arial"/>
+                <w:b w:val="false"/>
+                <w:bCs w:val="false"/>
+                <w:sz w:val="20"/>
+                <w:szCs w:val="20"/>
+              </w:rPr>
+              <w:t xml:space="preserve">Sí</w:t>
+            </w:r>
+          </w:p>
+        </w:tc>
+        <w:tc>
+          <w:p>
+            <w:pPr>
+              <w:jc w:val="left"/>
+            </w:pPr>
+            <w:r>
+              <w:rPr>
+                <w:rFonts w:ascii="Arial" w:cs="Arial" w:eastAsia="Arial" w:hAnsi="Arial"/>
+                <w:b w:val="false"/>
+                <w:bCs w:val="false"/>
+                <w:sz w:val="20"/>
+                <w:szCs w:val="20"/>
+              </w:rPr>
+              <w:t xml:space="preserve">Sí</w:t>
+            </w:r>
+          </w:p>
+        </w:tc>
+        <w:tc>
+          <w:p>
+            <w:pPr>
+              <w:jc w:val="left"/>
+            </w:pPr>
+            <w:r>
+              <w:rPr>
+                <w:rFonts w:ascii="Arial" w:cs="Arial" w:eastAsia="Arial" w:hAnsi="Arial"/>
+                <w:b w:val="false"/>
+                <w:bCs w:val="false"/>
+                <w:sz w:val="20"/>
+                <w:szCs w:val="20"/>
+              </w:rPr>
+              <w:t xml:space="preserve">No</w:t>
+            </w:r>
+          </w:p>
+        </w:tc>
+        <w:tc>
+          <w:p>
+            <w:pPr>
+              <w:jc w:val="left"/>
+            </w:pPr>
+            <w:r>
+              <w:rPr>
+                <w:rFonts w:ascii="Arial" w:cs="Arial" w:eastAsia="Arial" w:hAnsi="Arial"/>
+                <w:b w:val="false"/>
+                <w:bCs w:val="false"/>
+                <w:sz w:val="20"/>
+                <w:szCs w:val="20"/>
+              </w:rPr>
+              <w:t xml:space="preserve">No</w:t>
             </w:r>
           </w:p>
         </w:tc>
@@ -5857,7 +6406,7 @@
           <w:sz w:val="22"/>
           <w:szCs w:val="22"/>
         </w:rPr>
-        <w:t xml:space="preserve">Actores: Coordinación de Producción, Producción (Diseñador)</w:t>
+        <w:t xml:space="preserve">Actores: Coordinación de Producción, Jefe de Medios (supervisión), Producción (Diseñador)</w:t>
       </w:r>
     </w:p>
     <w:p>
@@ -5870,6 +6419,18 @@
           <w:szCs w:val="22"/>
         </w:rPr>
         <w:t xml:space="preserve">Aprobador: Coordinación de Producción</w:t>
+      </w:r>
+    </w:p>
+    <w:p>
+      <w:r>
+        <w:rPr>
+          <w:rFonts w:ascii="Arial" w:cs="Arial" w:eastAsia="Arial" w:hAnsi="Arial"/>
+          <w:b/>
+          <w:bCs/>
+          <w:sz w:val="22"/>
+          <w:szCs w:val="22"/>
+        </w:rPr>
+        <w:t xml:space="preserve">Notificados al iniciar: Coordinación de Producción y Jefe de Medios</w:t>
       </w:r>
     </w:p>
     <w:p/>
@@ -6589,6 +7150,16 @@
           <w:szCs w:val="22"/>
         </w:rPr>
         <w:t xml:space="preserve">• Coordinación de Producción: Seleccione al coordinador del equipo de diseño</w:t>
+      </w:r>
+    </w:p>
+    <w:p>
+      <w:r>
+        <w:rPr>
+          <w:rFonts w:ascii="Arial" w:cs="Arial" w:eastAsia="Arial" w:hAnsi="Arial"/>
+          <w:sz w:val="22"/>
+          <w:szCs w:val="22"/>
+        </w:rPr>
+        <w:t xml:space="preserve">• Jefe de Medios: Seleccione al jefe del área de medios educativos (recibirá notificaciones)</w:t>
       </w:r>
     </w:p>
     <w:p>
@@ -9527,7 +10098,7 @@
           <w:sz w:val="22"/>
           <w:szCs w:val="22"/>
         </w:rPr>
-        <w:t xml:space="preserve">R: Necesita el permiso mod/caracterizacion:vertodasmatrices. Este permiso está asignado a los roles de Asesor Metodológico y Coordinación de Producción.</w:t>
+        <w:t xml:space="preserve">R: Necesita el permiso mod/caracterizacion:vertodasmatrices. Este permiso está asignado a los roles de Asesor Metodológico, Coordinación de Producción y Jefe de Medios.</w:t>
       </w:r>
     </w:p>
     <w:p/>

</xml_diff>